<commit_message>
Word terminado, falta juntar todos
</commit_message>
<xml_diff>
--- a/p7/Práctica p7.docx
+++ b/p7/Práctica p7.docx
@@ -119,7 +119,19 @@
         <w:rPr>
           <w:rFonts w:ascii="Arial" w:hAnsi="Arial" w:cs="Arial"/>
         </w:rPr>
-        <w:t xml:space="preserve">-Poda inicial -&gt; se calculó un valor inicial. Este se calculó siguiendo el siguiente heurístico: Se coge el array de entrada, y se van cogiendo por pares los elementos de este. Sumas cada par y lo divides entre la capacidad. Los resultados de estas divisiones los debes ir guardando en una variable. </w:t>
+        <w:t>-Poda inicial -&gt; se calculó un valor inicial. Este se calculó siguiendo el siguiente heurístico</w:t>
+      </w:r>
+      <w:r>
+        <w:rPr>
+          <w:rFonts w:ascii="Arial" w:hAnsi="Arial" w:cs="Arial"/>
+        </w:rPr>
+        <w:t xml:space="preserve"> de ramificación</w:t>
+      </w:r>
+      <w:r>
+        <w:rPr>
+          <w:rFonts w:ascii="Arial" w:hAnsi="Arial" w:cs="Arial"/>
+        </w:rPr>
+        <w:t xml:space="preserve">: Se coge el array de entrada, y se van cogiendo por pares los elementos de este. Sumas cada par y lo divides entre la capacidad. Los resultados de estas divisiones los debes ir guardando en una variable. </w:t>
       </w:r>
     </w:p>
     <w:p>
@@ -243,14 +255,26 @@
         <w:rPr>
           <w:rFonts w:ascii="Arial" w:hAnsi="Arial" w:cs="Arial"/>
         </w:rPr>
-        <w:t>pre-calculado</w:t>
+        <w:t>precalculado</w:t>
       </w:r>
       <w:proofErr w:type="spellEnd"/>
       <w:r>
         <w:rPr>
           <w:rFonts w:ascii="Arial" w:hAnsi="Arial" w:cs="Arial"/>
         </w:rPr>
-        <w:t xml:space="preserve"> del numero “supuesto” de contenedores que usaremos para almacenar todos los elementos restantes. </w:t>
+        <w:t xml:space="preserve"> del </w:t>
+      </w:r>
+      <w:r>
+        <w:rPr>
+          <w:rFonts w:ascii="Arial" w:hAnsi="Arial" w:cs="Arial"/>
+        </w:rPr>
+        <w:t>número</w:t>
+      </w:r>
+      <w:r>
+        <w:rPr>
+          <w:rFonts w:ascii="Arial" w:hAnsi="Arial" w:cs="Arial"/>
+        </w:rPr>
+        <w:t xml:space="preserve"> “supuesto” de contenedores que usaremos para almacenar todos los elementos restantes. </w:t>
       </w:r>
     </w:p>
     <w:p>
@@ -322,6 +346,581 @@
           <w:rFonts w:ascii="Arial" w:hAnsi="Arial" w:cs="Arial"/>
         </w:rPr>
       </w:pPr>
+      <w:r>
+        <w:rPr>
+          <w:rFonts w:ascii="Arial" w:hAnsi="Arial" w:cs="Arial"/>
+        </w:rPr>
+        <w:t>Por último, usando las 2 técnicas anteriores, podemos construir la condición de poda del algoritmo. En código se vería así:</w:t>
+      </w:r>
+    </w:p>
+    <w:p>
+      <w:pPr>
+        <w:jc w:val="both"/>
+        <w:rPr>
+          <w:rFonts w:ascii="Arial" w:hAnsi="Arial" w:cs="Arial"/>
+        </w:rPr>
+      </w:pPr>
+      <w:r>
+        <w:rPr>
+          <w:rFonts w:ascii="Arial" w:hAnsi="Arial" w:cs="Arial"/>
+        </w:rPr>
+        <w:drawing>
+          <wp:inline distT="0" distB="0" distL="0" distR="0" wp14:anchorId="333FB0A7" wp14:editId="4061E58E">
+            <wp:extent cx="5400040" cy="353695"/>
+            <wp:effectExtent l="0" t="0" r="0" b="8255"/>
+            <wp:docPr id="254594363" name="Imagen 1"/>
+            <wp:cNvGraphicFramePr>
+              <a:graphicFrameLocks xmlns:a="http://schemas.openxmlformats.org/drawingml/2006/main" noChangeAspect="1"/>
+            </wp:cNvGraphicFramePr>
+            <a:graphic xmlns:a="http://schemas.openxmlformats.org/drawingml/2006/main">
+              <a:graphicData uri="http://schemas.openxmlformats.org/drawingml/2006/picture">
+                <pic:pic xmlns:pic="http://schemas.openxmlformats.org/drawingml/2006/picture">
+                  <pic:nvPicPr>
+                    <pic:cNvPr id="254594363" name=""/>
+                    <pic:cNvPicPr/>
+                  </pic:nvPicPr>
+                  <pic:blipFill>
+                    <a:blip r:embed="rId7"/>
+                    <a:stretch>
+                      <a:fillRect/>
+                    </a:stretch>
+                  </pic:blipFill>
+                  <pic:spPr>
+                    <a:xfrm>
+                      <a:off x="0" y="0"/>
+                      <a:ext cx="5400040" cy="353695"/>
+                    </a:xfrm>
+                    <a:prstGeom prst="rect">
+                      <a:avLst/>
+                    </a:prstGeom>
+                  </pic:spPr>
+                </pic:pic>
+              </a:graphicData>
+            </a:graphic>
+          </wp:inline>
+        </w:drawing>
+      </w:r>
+      <w:r>
+        <w:rPr>
+          <w:rFonts w:ascii="Arial" w:hAnsi="Arial" w:cs="Arial"/>
+        </w:rPr>
+        <w:t xml:space="preserve"> </w:t>
+      </w:r>
+    </w:p>
+    <w:p>
+      <w:pPr>
+        <w:jc w:val="both"/>
+        <w:rPr>
+          <w:rFonts w:ascii="Arial" w:hAnsi="Arial" w:cs="Arial"/>
+        </w:rPr>
+      </w:pPr>
+      <w:r>
+        <w:rPr>
+          <w:rFonts w:ascii="Arial" w:hAnsi="Arial" w:cs="Arial"/>
+        </w:rPr>
+        <w:t>La idea es: si el número de contenedores hasta ese nivel/</w:t>
+      </w:r>
+      <w:r>
+        <w:rPr>
+          <w:rFonts w:ascii="Arial" w:hAnsi="Arial" w:cs="Arial"/>
+        </w:rPr>
+        <w:t>iteración</w:t>
+      </w:r>
+      <w:r>
+        <w:rPr>
+          <w:rFonts w:ascii="Arial" w:hAnsi="Arial" w:cs="Arial"/>
+        </w:rPr>
+        <w:t xml:space="preserve"> </w:t>
+      </w:r>
+      <w:r>
+        <w:rPr>
+          <w:rFonts w:ascii="Arial" w:hAnsi="Arial" w:cs="Arial"/>
+        </w:rPr>
+        <w:t>más</w:t>
+      </w:r>
+      <w:r>
+        <w:rPr>
+          <w:rFonts w:ascii="Arial" w:hAnsi="Arial" w:cs="Arial"/>
+        </w:rPr>
+        <w:t xml:space="preserve"> el mínimo teórico (</w:t>
+      </w:r>
+      <w:proofErr w:type="spellStart"/>
+      <w:r>
+        <w:rPr>
+          <w:rFonts w:ascii="Arial" w:hAnsi="Arial" w:cs="Arial"/>
+        </w:rPr>
+        <w:t>lowerBound</w:t>
+      </w:r>
+      <w:proofErr w:type="spellEnd"/>
+      <w:r>
+        <w:rPr>
+          <w:rFonts w:ascii="Arial" w:hAnsi="Arial" w:cs="Arial"/>
+        </w:rPr>
+        <w:t xml:space="preserve">) es mayor que la mejor solución (si </w:t>
+      </w:r>
+      <w:r>
+        <w:rPr>
+          <w:rFonts w:ascii="Arial" w:hAnsi="Arial" w:cs="Arial"/>
+        </w:rPr>
+        <w:t>no se encontró solución</w:t>
+      </w:r>
+      <w:r>
+        <w:rPr>
+          <w:rFonts w:ascii="Arial" w:hAnsi="Arial" w:cs="Arial"/>
+        </w:rPr>
+        <w:t xml:space="preserve"> sería la poda inicial calculada, y si</w:t>
+      </w:r>
+      <w:r>
+        <w:rPr>
+          <w:rFonts w:ascii="Arial" w:hAnsi="Arial" w:cs="Arial"/>
+        </w:rPr>
+        <w:t xml:space="preserve"> </w:t>
+      </w:r>
+      <w:r>
+        <w:rPr>
+          <w:rFonts w:ascii="Arial" w:hAnsi="Arial" w:cs="Arial"/>
+        </w:rPr>
+        <w:t xml:space="preserve">no </w:t>
+      </w:r>
+      <w:r>
+        <w:rPr>
+          <w:rFonts w:ascii="Arial" w:hAnsi="Arial" w:cs="Arial"/>
+        </w:rPr>
+        <w:t>sería</w:t>
+      </w:r>
+      <w:r>
+        <w:rPr>
+          <w:rFonts w:ascii="Arial" w:hAnsi="Arial" w:cs="Arial"/>
+        </w:rPr>
+        <w:t xml:space="preserve"> la mejor solución encontrada)</w:t>
+      </w:r>
+      <w:r>
+        <w:rPr>
+          <w:rFonts w:ascii="Arial" w:hAnsi="Arial" w:cs="Arial"/>
+        </w:rPr>
+        <w:t>, entonces descartas ese camino.</w:t>
+      </w:r>
+    </w:p>
+    <w:p>
+      <w:pPr>
+        <w:jc w:val="both"/>
+        <w:rPr>
+          <w:rFonts w:ascii="Arial" w:hAnsi="Arial" w:cs="Arial"/>
+        </w:rPr>
+      </w:pPr>
+      <w:r>
+        <w:rPr>
+          <w:rFonts w:ascii="Arial" w:hAnsi="Arial" w:cs="Arial"/>
+        </w:rPr>
+        <w:t xml:space="preserve">De esta manera, dejamos de evaluar muchos caminos que no nos van a llevar a una solución mejor que la ya obtenida. </w:t>
+      </w:r>
+    </w:p>
+    <w:p>
+      <w:pPr>
+        <w:jc w:val="both"/>
+        <w:rPr>
+          <w:rFonts w:ascii="Arial" w:hAnsi="Arial" w:cs="Arial"/>
+        </w:rPr>
+      </w:pPr>
+      <w:r>
+        <w:rPr>
+          <w:rFonts w:ascii="Arial" w:hAnsi="Arial" w:cs="Arial"/>
+        </w:rPr>
+        <w:t>El resto de código de la clase sería este:</w:t>
+      </w:r>
+    </w:p>
+    <w:p>
+      <w:pPr>
+        <w:jc w:val="both"/>
+        <w:rPr>
+          <w:rFonts w:ascii="Arial" w:hAnsi="Arial" w:cs="Arial"/>
+        </w:rPr>
+      </w:pPr>
+      <w:r>
+        <w:rPr>
+          <w:rFonts w:ascii="Arial" w:hAnsi="Arial" w:cs="Arial"/>
+        </w:rPr>
+        <w:drawing>
+          <wp:inline distT="0" distB="0" distL="0" distR="0" wp14:anchorId="34313C7F" wp14:editId="4E79E876">
+            <wp:extent cx="4953663" cy="3422827"/>
+            <wp:effectExtent l="0" t="0" r="0" b="6350"/>
+            <wp:docPr id="897652293" name="Imagen 1"/>
+            <wp:cNvGraphicFramePr>
+              <a:graphicFrameLocks xmlns:a="http://schemas.openxmlformats.org/drawingml/2006/main" noChangeAspect="1"/>
+            </wp:cNvGraphicFramePr>
+            <a:graphic xmlns:a="http://schemas.openxmlformats.org/drawingml/2006/main">
+              <a:graphicData uri="http://schemas.openxmlformats.org/drawingml/2006/picture">
+                <pic:pic xmlns:pic="http://schemas.openxmlformats.org/drawingml/2006/picture">
+                  <pic:nvPicPr>
+                    <pic:cNvPr id="897652293" name=""/>
+                    <pic:cNvPicPr/>
+                  </pic:nvPicPr>
+                  <pic:blipFill>
+                    <a:blip r:embed="rId8"/>
+                    <a:stretch>
+                      <a:fillRect/>
+                    </a:stretch>
+                  </pic:blipFill>
+                  <pic:spPr>
+                    <a:xfrm>
+                      <a:off x="0" y="0"/>
+                      <a:ext cx="4955459" cy="3424068"/>
+                    </a:xfrm>
+                    <a:prstGeom prst="rect">
+                      <a:avLst/>
+                    </a:prstGeom>
+                  </pic:spPr>
+                </pic:pic>
+              </a:graphicData>
+            </a:graphic>
+          </wp:inline>
+        </w:drawing>
+      </w:r>
+    </w:p>
+    <w:p>
+      <w:pPr>
+        <w:jc w:val="both"/>
+        <w:rPr>
+          <w:rFonts w:ascii="Arial" w:hAnsi="Arial" w:cs="Arial"/>
+        </w:rPr>
+      </w:pPr>
+      <w:r>
+        <w:rPr>
+          <w:rFonts w:ascii="Arial" w:hAnsi="Arial" w:cs="Arial"/>
+        </w:rPr>
+        <w:lastRenderedPageBreak/>
+        <w:drawing>
+          <wp:inline distT="0" distB="0" distL="0" distR="0" wp14:anchorId="66F4F41F" wp14:editId="76479F4A">
+            <wp:extent cx="5017273" cy="2848471"/>
+            <wp:effectExtent l="0" t="0" r="0" b="9525"/>
+            <wp:docPr id="1748528600" name="Imagen 1"/>
+            <wp:cNvGraphicFramePr>
+              <a:graphicFrameLocks xmlns:a="http://schemas.openxmlformats.org/drawingml/2006/main" noChangeAspect="1"/>
+            </wp:cNvGraphicFramePr>
+            <a:graphic xmlns:a="http://schemas.openxmlformats.org/drawingml/2006/main">
+              <a:graphicData uri="http://schemas.openxmlformats.org/drawingml/2006/picture">
+                <pic:pic xmlns:pic="http://schemas.openxmlformats.org/drawingml/2006/picture">
+                  <pic:nvPicPr>
+                    <pic:cNvPr id="1748528600" name=""/>
+                    <pic:cNvPicPr/>
+                  </pic:nvPicPr>
+                  <pic:blipFill>
+                    <a:blip r:embed="rId9"/>
+                    <a:stretch>
+                      <a:fillRect/>
+                    </a:stretch>
+                  </pic:blipFill>
+                  <pic:spPr>
+                    <a:xfrm>
+                      <a:off x="0" y="0"/>
+                      <a:ext cx="5026813" cy="2853887"/>
+                    </a:xfrm>
+                    <a:prstGeom prst="rect">
+                      <a:avLst/>
+                    </a:prstGeom>
+                  </pic:spPr>
+                </pic:pic>
+              </a:graphicData>
+            </a:graphic>
+          </wp:inline>
+        </w:drawing>
+      </w:r>
+    </w:p>
+    <w:p>
+      <w:pPr>
+        <w:jc w:val="both"/>
+        <w:rPr>
+          <w:rFonts w:ascii="Arial" w:hAnsi="Arial" w:cs="Arial"/>
+        </w:rPr>
+      </w:pPr>
+      <w:r>
+        <w:rPr>
+          <w:rFonts w:ascii="Arial" w:hAnsi="Arial" w:cs="Arial"/>
+        </w:rPr>
+        <w:drawing>
+          <wp:inline distT="0" distB="0" distL="0" distR="0" wp14:anchorId="18674FF6" wp14:editId="354BEA51">
+            <wp:extent cx="5017135" cy="2900900"/>
+            <wp:effectExtent l="0" t="0" r="0" b="0"/>
+            <wp:docPr id="1277098938" name="Imagen 1"/>
+            <wp:cNvGraphicFramePr>
+              <a:graphicFrameLocks xmlns:a="http://schemas.openxmlformats.org/drawingml/2006/main" noChangeAspect="1"/>
+            </wp:cNvGraphicFramePr>
+            <a:graphic xmlns:a="http://schemas.openxmlformats.org/drawingml/2006/main">
+              <a:graphicData uri="http://schemas.openxmlformats.org/drawingml/2006/picture">
+                <pic:pic xmlns:pic="http://schemas.openxmlformats.org/drawingml/2006/picture">
+                  <pic:nvPicPr>
+                    <pic:cNvPr id="1277098938" name=""/>
+                    <pic:cNvPicPr/>
+                  </pic:nvPicPr>
+                  <pic:blipFill>
+                    <a:blip r:embed="rId10"/>
+                    <a:stretch>
+                      <a:fillRect/>
+                    </a:stretch>
+                  </pic:blipFill>
+                  <pic:spPr>
+                    <a:xfrm>
+                      <a:off x="0" y="0"/>
+                      <a:ext cx="5020172" cy="2902656"/>
+                    </a:xfrm>
+                    <a:prstGeom prst="rect">
+                      <a:avLst/>
+                    </a:prstGeom>
+                  </pic:spPr>
+                </pic:pic>
+              </a:graphicData>
+            </a:graphic>
+          </wp:inline>
+        </w:drawing>
+      </w:r>
+    </w:p>
+    <w:p>
+      <w:pPr>
+        <w:jc w:val="both"/>
+        <w:rPr>
+          <w:rFonts w:ascii="Arial" w:hAnsi="Arial" w:cs="Arial"/>
+        </w:rPr>
+      </w:pPr>
+      <w:r>
+        <w:rPr>
+          <w:rFonts w:ascii="Arial" w:hAnsi="Arial" w:cs="Arial"/>
+        </w:rPr>
+        <w:drawing>
+          <wp:inline distT="0" distB="0" distL="0" distR="0" wp14:anchorId="37762D5F" wp14:editId="5856FAFE">
+            <wp:extent cx="5049079" cy="2642692"/>
+            <wp:effectExtent l="0" t="0" r="0" b="5715"/>
+            <wp:docPr id="655853829" name="Imagen 1"/>
+            <wp:cNvGraphicFramePr>
+              <a:graphicFrameLocks xmlns:a="http://schemas.openxmlformats.org/drawingml/2006/main" noChangeAspect="1"/>
+            </wp:cNvGraphicFramePr>
+            <a:graphic xmlns:a="http://schemas.openxmlformats.org/drawingml/2006/main">
+              <a:graphicData uri="http://schemas.openxmlformats.org/drawingml/2006/picture">
+                <pic:pic xmlns:pic="http://schemas.openxmlformats.org/drawingml/2006/picture">
+                  <pic:nvPicPr>
+                    <pic:cNvPr id="655853829" name=""/>
+                    <pic:cNvPicPr/>
+                  </pic:nvPicPr>
+                  <pic:blipFill>
+                    <a:blip r:embed="rId11"/>
+                    <a:stretch>
+                      <a:fillRect/>
+                    </a:stretch>
+                  </pic:blipFill>
+                  <pic:spPr>
+                    <a:xfrm>
+                      <a:off x="0" y="0"/>
+                      <a:ext cx="5060332" cy="2648582"/>
+                    </a:xfrm>
+                    <a:prstGeom prst="rect">
+                      <a:avLst/>
+                    </a:prstGeom>
+                  </pic:spPr>
+                </pic:pic>
+              </a:graphicData>
+            </a:graphic>
+          </wp:inline>
+        </w:drawing>
+      </w:r>
+    </w:p>
+    <w:p>
+      <w:pPr>
+        <w:jc w:val="both"/>
+        <w:rPr>
+          <w:rFonts w:ascii="Arial" w:hAnsi="Arial" w:cs="Arial"/>
+        </w:rPr>
+      </w:pPr>
+      <w:r>
+        <w:rPr>
+          <w:rFonts w:ascii="Arial" w:hAnsi="Arial" w:cs="Arial"/>
+        </w:rPr>
+        <w:lastRenderedPageBreak/>
+        <w:t xml:space="preserve">En tiempos, hay una reducción muy notable, tan notable como que en la p6 algunos casos </w:t>
+      </w:r>
+      <w:proofErr w:type="gramStart"/>
+      <w:r>
+        <w:rPr>
+          <w:rFonts w:ascii="Arial" w:hAnsi="Arial" w:cs="Arial"/>
+        </w:rPr>
+        <w:t>de test</w:t>
+      </w:r>
+      <w:proofErr w:type="gramEnd"/>
+      <w:r>
+        <w:rPr>
+          <w:rFonts w:ascii="Arial" w:hAnsi="Arial" w:cs="Arial"/>
+        </w:rPr>
+        <w:t xml:space="preserve"> no terminaban, y en este caso sí. A continuación, se muestra una comparación:</w:t>
+      </w:r>
+    </w:p>
+    <w:p>
+      <w:pPr>
+        <w:jc w:val="both"/>
+        <w:rPr>
+          <w:rFonts w:ascii="Arial" w:hAnsi="Arial" w:cs="Arial"/>
+        </w:rPr>
+      </w:pPr>
+      <w:r>
+        <w:rPr>
+          <w:rFonts w:ascii="Arial" w:hAnsi="Arial" w:cs="Arial"/>
+        </w:rPr>
+        <w:t>Tabla de tiempos p6 (</w:t>
+      </w:r>
+      <w:proofErr w:type="spellStart"/>
+      <w:r>
+        <w:rPr>
+          <w:rFonts w:ascii="Arial" w:hAnsi="Arial" w:cs="Arial"/>
+        </w:rPr>
+        <w:t>backtracking</w:t>
+      </w:r>
+      <w:proofErr w:type="spellEnd"/>
+      <w:r>
+        <w:rPr>
+          <w:rFonts w:ascii="Arial" w:hAnsi="Arial" w:cs="Arial"/>
+        </w:rPr>
+        <w:t xml:space="preserve"> original):</w:t>
+      </w:r>
+    </w:p>
+    <w:p>
+      <w:pPr>
+        <w:jc w:val="both"/>
+        <w:rPr>
+          <w:rFonts w:ascii="Arial" w:hAnsi="Arial" w:cs="Arial"/>
+        </w:rPr>
+      </w:pPr>
+      <w:r>
+        <w:rPr>
+          <w:rFonts w:ascii="Arial" w:hAnsi="Arial" w:cs="Arial"/>
+        </w:rPr>
+        <w:drawing>
+          <wp:inline distT="0" distB="0" distL="0" distR="0" wp14:anchorId="1F624B22" wp14:editId="2D03871F">
+            <wp:extent cx="3379305" cy="2998617"/>
+            <wp:effectExtent l="0" t="0" r="0" b="0"/>
+            <wp:docPr id="319310008" name="Imagen 1"/>
+            <wp:cNvGraphicFramePr>
+              <a:graphicFrameLocks xmlns:a="http://schemas.openxmlformats.org/drawingml/2006/main" noChangeAspect="1"/>
+            </wp:cNvGraphicFramePr>
+            <a:graphic xmlns:a="http://schemas.openxmlformats.org/drawingml/2006/main">
+              <a:graphicData uri="http://schemas.openxmlformats.org/drawingml/2006/picture">
+                <pic:pic xmlns:pic="http://schemas.openxmlformats.org/drawingml/2006/picture">
+                  <pic:nvPicPr>
+                    <pic:cNvPr id="319310008" name=""/>
+                    <pic:cNvPicPr/>
+                  </pic:nvPicPr>
+                  <pic:blipFill>
+                    <a:blip r:embed="rId12"/>
+                    <a:stretch>
+                      <a:fillRect/>
+                    </a:stretch>
+                  </pic:blipFill>
+                  <pic:spPr>
+                    <a:xfrm>
+                      <a:off x="0" y="0"/>
+                      <a:ext cx="3385391" cy="3004017"/>
+                    </a:xfrm>
+                    <a:prstGeom prst="rect">
+                      <a:avLst/>
+                    </a:prstGeom>
+                  </pic:spPr>
+                </pic:pic>
+              </a:graphicData>
+            </a:graphic>
+          </wp:inline>
+        </w:drawing>
+      </w:r>
+    </w:p>
+    <w:p>
+      <w:pPr>
+        <w:jc w:val="both"/>
+        <w:rPr>
+          <w:rFonts w:ascii="Arial" w:hAnsi="Arial" w:cs="Arial"/>
+        </w:rPr>
+      </w:pPr>
+      <w:r>
+        <w:rPr>
+          <w:rFonts w:ascii="Arial" w:hAnsi="Arial" w:cs="Arial"/>
+        </w:rPr>
+        <w:t>Tabla de tiempos p7 (</w:t>
+      </w:r>
+      <w:proofErr w:type="spellStart"/>
+      <w:r>
+        <w:rPr>
+          <w:rFonts w:ascii="Arial" w:hAnsi="Arial" w:cs="Arial"/>
+        </w:rPr>
+        <w:t>backtracking</w:t>
+      </w:r>
+      <w:proofErr w:type="spellEnd"/>
+      <w:r>
+        <w:rPr>
+          <w:rFonts w:ascii="Arial" w:hAnsi="Arial" w:cs="Arial"/>
+        </w:rPr>
+        <w:t xml:space="preserve"> + </w:t>
+      </w:r>
+      <w:proofErr w:type="spellStart"/>
+      <w:r>
+        <w:rPr>
+          <w:rFonts w:ascii="Arial" w:hAnsi="Arial" w:cs="Arial"/>
+        </w:rPr>
+        <w:t>RyP</w:t>
+      </w:r>
+      <w:proofErr w:type="spellEnd"/>
+      <w:r>
+        <w:rPr>
+          <w:rFonts w:ascii="Arial" w:hAnsi="Arial" w:cs="Arial"/>
+        </w:rPr>
+        <w:t>):</w:t>
+      </w:r>
+    </w:p>
+    <w:p>
+      <w:pPr>
+        <w:jc w:val="both"/>
+      </w:pPr>
+      <w:r>
+        <w:rPr>
+          <w:rFonts w:ascii="Arial" w:hAnsi="Arial" w:cs="Arial"/>
+        </w:rPr>
+        <w:drawing>
+          <wp:inline distT="0" distB="0" distL="0" distR="0" wp14:anchorId="23846F07" wp14:editId="2AA41498">
+            <wp:extent cx="3315163" cy="2924583"/>
+            <wp:effectExtent l="0" t="0" r="0" b="9525"/>
+            <wp:docPr id="2064949508" name="Imagen 1"/>
+            <wp:cNvGraphicFramePr>
+              <a:graphicFrameLocks xmlns:a="http://schemas.openxmlformats.org/drawingml/2006/main" noChangeAspect="1"/>
+            </wp:cNvGraphicFramePr>
+            <a:graphic xmlns:a="http://schemas.openxmlformats.org/drawingml/2006/main">
+              <a:graphicData uri="http://schemas.openxmlformats.org/drawingml/2006/picture">
+                <pic:pic xmlns:pic="http://schemas.openxmlformats.org/drawingml/2006/picture">
+                  <pic:nvPicPr>
+                    <pic:cNvPr id="2064949508" name=""/>
+                    <pic:cNvPicPr/>
+                  </pic:nvPicPr>
+                  <pic:blipFill>
+                    <a:blip r:embed="rId13"/>
+                    <a:stretch>
+                      <a:fillRect/>
+                    </a:stretch>
+                  </pic:blipFill>
+                  <pic:spPr>
+                    <a:xfrm>
+                      <a:off x="0" y="0"/>
+                      <a:ext cx="3315163" cy="2924583"/>
+                    </a:xfrm>
+                    <a:prstGeom prst="rect">
+                      <a:avLst/>
+                    </a:prstGeom>
+                  </pic:spPr>
+                </pic:pic>
+              </a:graphicData>
+            </a:graphic>
+          </wp:inline>
+        </w:drawing>
+      </w:r>
+    </w:p>
+    <w:p>
+      <w:pPr>
+        <w:jc w:val="both"/>
+      </w:pPr>
+      <w:r>
+        <w:t>Como se puede observar, la mejora en los tiempos es muy visible. Por lo tanto, podemos decir que nuestras técnicas de poda funcionan a la perfección.</w:t>
+      </w:r>
     </w:p>
     <w:sectPr>
       <w:pgSz w:w="11906" w:h="16838"/>
@@ -1056,7 +1655,6 @@
   <w:style w:type="character" w:default="1" w:styleId="Fuentedeprrafopredeter">
     <w:name w:val="Default Paragraph Font"/>
     <w:uiPriority w:val="1"/>
-    <w:semiHidden/>
     <w:unhideWhenUsed/>
   </w:style>
   <w:style w:type="table" w:default="1" w:styleId="Tablanormal">

</xml_diff>